<commit_message>
Document the live deployment and remaining account verification
</commit_message>
<xml_diff>
--- a/docs/word/02_Entregable_2_Avance_50.docx
+++ b/docs/word/02_Entregable_2_Avance_50.docx
@@ -466,7 +466,7 @@
                 <w:color w:val="000000"/>
                 <w:sz w:val="22"/>
               </w:rPr>
-              <w:t>Conexión y prueba remota pendientes de configurar.</w:t>
+              <w:t>Conexión y disponibilidad remota verificadas; falta la prueba autenticada de venta.</w:t>
             </w:r>
           </w:p>
         </w:tc>
@@ -1538,7 +1538,7 @@
               <a:graphicData uri="http://schemas.openxmlformats.org/drawingml/2006/picture">
                 <pic:pic>
                   <pic:nvPicPr>
-                    <pic:cNvPr id="0" name="tmpua4npnws.png"/>
+                    <pic:cNvPr id="0" name="tmpn8w8niu6.png"/>
                     <pic:cNvPicPr/>
                   </pic:nvPicPr>
                   <pic:blipFill>
@@ -2424,7 +2424,7 @@
           <w:color w:val="000000"/>
           <w:sz w:val="22"/>
         </w:rPr>
-        <w:t>El workflow `.github/workflows/ci.yml` compila los dos modos del frontend, compila la solución .NET y verifica que el programa Java compile. El workflow de GitHub Pages publica solo la demo estática. La prueba HTTP de venta con PostgreSQL queda pendiente de ejecutar contra el proyecto Supabase de desarrollo.</w:t>
+        <w:t>El workflow `.github/workflows/ci.yml` compila los dos modos del frontend, compila la solución .NET y verifica que el programa Java compile. El workflow de GitHub Pages publica el frontend conectado a la API de Render. La prueba HTTP de venta con PostgreSQL queda pendiente de ejecutar contra el proyecto Supabase de desarrollo.</w:t>
       </w:r>
     </w:p>
     <w:p>
@@ -2526,7 +2526,7 @@
           <w:color w:val="000000"/>
           <w:sz w:val="22"/>
         </w:rPr>
-        <w:t>Validación técnica: 18 pruebas locales aprobadas; frontend y .NET compilan, con cero errores y advertencias en .NET; Java compila. La revisión de navegador se realizó en modo demo. La conexión privada del backend, integración HTTP PostgreSQL, despliegue Render y aceptación del Grupo 10 están pendientes. La evidencia detallada está en docs/evidencias/validacion_tecnica_2026-10-04.md.</w:t>
+        <w:t>Validación técnica: 18 pruebas locales aprobadas y compilaciones correctas. Render está publicado y conectado a Supabase con TLS y certificado validado; /api/health/ready responde HTTP 200 y las rutas privadas rechazan acceso anónimo. GitHub Pages usa la API remota. Falta confirmar la cuenta inicial, probar operaciones autenticadas y registrar aceptación del Grupo 10. Evidencia: docs/evidencias/validacion_tecnica_2026-10-04.md.</w:t>
       </w:r>
     </w:p>
     <w:p>
@@ -2565,7 +2565,7 @@
               <a:graphicData uri="http://schemas.openxmlformats.org/drawingml/2006/picture">
                 <pic:pic>
                   <pic:nvPicPr>
-                    <pic:cNvPr id="0" name="tmpfxvou6_4.png"/>
+                    <pic:cNvPr id="0" name="tmpvkeyacpo.png"/>
                     <pic:cNvPicPr/>
                   </pic:nvPicPr>
                   <pic:blipFill>
@@ -2623,7 +2623,7 @@
               <a:graphicData uri="http://schemas.openxmlformats.org/drawingml/2006/picture">
                 <pic:pic>
                   <pic:nvPicPr>
-                    <pic:cNvPr id="0" name="tmpslkdzms4.png"/>
+                    <pic:cNvPr id="0" name="tmpi75xretd.png"/>
                     <pic:cNvPicPr/>
                   </pic:nvPicPr>
                   <pic:blipFill>

</xml_diff>

<commit_message>
Finalize Group 10 reports manuals color evidence and delivery documentation
</commit_message>
<xml_diff>
--- a/docs/word/02_Entregable_2_Avance_50.docx
+++ b/docs/word/02_Entregable_2_Avance_50.docx
@@ -1538,7 +1538,7 @@
               <a:graphicData uri="http://schemas.openxmlformats.org/drawingml/2006/picture">
                 <pic:pic>
                   <pic:nvPicPr>
-                    <pic:cNvPr id="0" name="tmpn8w8niu6.png"/>
+                    <pic:cNvPr id="0" name="tmpnwnpzxgu.png"/>
                     <pic:cNvPicPr/>
                   </pic:nvPicPr>
                   <pic:blipFill>
@@ -2395,11 +2395,11 @@
     <w:p>
       <w:r>
         <w:rPr>
-          <w:rFonts w:ascii="Arial" w:hAnsi="Arial" w:eastAsia="Arial"/>
+          <w:rFonts w:ascii="Arial" w:hAnsi="Arial"/>
           <w:color w:val="000000"/>
           <w:sz w:val="22"/>
         </w:rPr>
-        <w:t>El registro detallado se encuentra en `docs/evidencias/validacion_tecnica_2026-09-28.md`. La prueba HTTP documentada corresponde a la versión histórica SQL Server. El backend Npgsql actual ya compila, pero su conexión Supabase aún requiere la cadena de conexión del proyecto nuevo.</w:t>
+        <w:t>El registro detallado se adjunta como Anexo de evidencias de validación técnica de Bodega Norte, en el archivo Anexo_Evidencias_Tecnicas_Grupo10.docx. Incluye los registros del 28 de septiembre y del 4 de octubre de 2026. La prueba HTTP de venta y stock corresponde a SQL Server. La conexión del backend Npgsql con Supabase se verificó el 4 de octubre; la prueba autenticada de venta y stock en PostgreSQL permanece pendiente.</w:t>
       </w:r>
     </w:p>
     <w:p>
@@ -2526,7 +2526,7 @@
           <w:color w:val="000000"/>
           <w:sz w:val="22"/>
         </w:rPr>
-        <w:t>Validación técnica: 18 pruebas locales aprobadas y compilaciones correctas. Render está publicado y conectado a Supabase con TLS y certificado validado; /api/health/ready responde HTTP 200 y las rutas privadas rechazan acceso anónimo. GitHub Pages usa la API remota. Falta confirmar la cuenta inicial, probar operaciones autenticadas y registrar aceptación del Grupo 10. Evidencia: docs/evidencias/validacion_tecnica_2026-10-04.md.</w:t>
+        <w:t>Validación técnica: 18 pruebas locales aprobadas y compilaciones correctas. El 4 de octubre de 2026 se verificaron Render, la conexión TLS con Supabase, el rechazo de acceso anónimo y el ingreso de la cuenta inicial como administrador activo. GitHub Pages usa la API remota. Las pruebas de escritura autenticada y la aceptación del Grupo 10 permanecen pendientes. Las nuevas capturas de la sección 8 documentan el modo de demostración local.</w:t>
       </w:r>
     </w:p>
     <w:p>
@@ -2542,6 +2542,31 @@
           <w:sz w:val="22"/>
         </w:rPr>
         <w:t>8. Evidencias visuales</w:t>
+      </w:r>
+    </w:p>
+    <w:p>
+      <w:r>
+        <w:rPr>
+          <w:rFonts w:ascii="Arial" w:hAnsi="Arial" w:eastAsia="Arial"/>
+          <w:color w:val="000000"/>
+          <w:sz w:val="22"/>
+        </w:rPr>
+        <w:t>La sección reúne seis capturas: las dos referencias de escritorio y móvil del informe original y cuatro vistas complementarias obtenidas el 11 de octubre de 2026. Las capturas nuevas corresponden a la demostración local con datos ficticios; documentan la interfaz y no constituyen aceptación de una bodega real ni una prueba de persistencia en Supabase.</w:t>
+      </w:r>
+    </w:p>
+    <w:p>
+      <w:pPr>
+        <w:pStyle w:val="Heading2"/>
+        <w:keepNext/>
+        <w:keepLines/>
+      </w:pPr>
+      <w:r>
+        <w:rPr>
+          <w:rFonts w:ascii="Arial" w:hAnsi="Arial" w:eastAsia="Arial"/>
+          <w:color w:val="000000"/>
+          <w:sz w:val="22"/>
+        </w:rPr>
+        <w:t>8.1 Panel en escritorio</w:t>
       </w:r>
     </w:p>
     <w:p>
@@ -2565,7 +2590,7 @@
               <a:graphicData uri="http://schemas.openxmlformats.org/drawingml/2006/picture">
                 <pic:pic>
                   <pic:nvPicPr>
-                    <pic:cNvPr id="0" name="tmpvkeyacpo.png"/>
+                    <pic:cNvPr id="0" name="tmpkcwe20ud.png"/>
                     <pic:cNvPicPr/>
                   </pic:nvPicPr>
                   <pic:blipFill>
@@ -2599,7 +2624,32 @@
           <w:color w:val="000000"/>
           <w:sz w:val="22"/>
         </w:rPr>
-        <w:t>Evidencia visual de referencia en escritorio</w:t>
+        <w:t>Captura 1. Referencia visual del panel en escritorio</w:t>
+      </w:r>
+    </w:p>
+    <w:p>
+      <w:r>
+        <w:rPr>
+          <w:rFonts w:ascii="Arial" w:hAnsi="Arial" w:eastAsia="Arial"/>
+          <w:color w:val="000000"/>
+          <w:sz w:val="22"/>
+        </w:rPr>
+        <w:t>El panel presenta indicadores de ventas, existencias y productos por reponer. Esta imagen conserva la referencia visual incluida en el informe original.</w:t>
+      </w:r>
+    </w:p>
+    <w:p>
+      <w:pPr>
+        <w:pStyle w:val="Heading2"/>
+        <w:keepNext/>
+        <w:keepLines/>
+      </w:pPr>
+      <w:r>
+        <w:rPr>
+          <w:rFonts w:ascii="Arial" w:hAnsi="Arial" w:eastAsia="Arial"/>
+          <w:color w:val="000000"/>
+          <w:sz w:val="22"/>
+        </w:rPr>
+        <w:t>8.2 Panel en móvil</w:t>
       </w:r>
     </w:p>
     <w:p>
@@ -2623,7 +2673,7 @@
               <a:graphicData uri="http://schemas.openxmlformats.org/drawingml/2006/picture">
                 <pic:pic>
                   <pic:nvPicPr>
-                    <pic:cNvPr id="0" name="tmpi75xretd.png"/>
+                    <pic:cNvPr id="0" name="tmppkrp7aio.png"/>
                     <pic:cNvPicPr/>
                   </pic:nvPicPr>
                   <pic:blipFill>
@@ -2657,12 +2707,434 @@
           <w:color w:val="000000"/>
           <w:sz w:val="22"/>
         </w:rPr>
-        <w:t>Evidencia visual de referencia en móvil</w:t>
+        <w:t>Captura 2. Referencia visual del panel en móvil</w:t>
+      </w:r>
+    </w:p>
+    <w:p>
+      <w:r>
+        <w:rPr>
+          <w:rFonts w:ascii="Arial" w:hAnsi="Arial" w:eastAsia="Arial"/>
+          <w:color w:val="000000"/>
+          <w:sz w:val="22"/>
+        </w:rPr>
+        <w:t>La disposición móvil reúne los indicadores y la actividad de ventas en una columna. Se conserva como referencia del diseño responsive.</w:t>
+      </w:r>
+    </w:p>
+    <w:p>
+      <w:r>
+        <w:rPr>
+          <w:rFonts w:ascii="Arial" w:hAnsi="Arial" w:eastAsia="Arial"/>
+          <w:color w:val="000000"/>
+          <w:sz w:val="22"/>
+        </w:rPr>
+        <w:br w:type="page"/>
+      </w:r>
+    </w:p>
+    <w:p>
+      <w:pPr>
+        <w:pStyle w:val="Heading2"/>
+        <w:keepNext/>
+        <w:keepLines/>
+      </w:pPr>
+      <w:r>
+        <w:rPr>
+          <w:rFonts w:ascii="Arial" w:hAnsi="Arial" w:eastAsia="Arial"/>
+          <w:color w:val="000000"/>
+          <w:sz w:val="22"/>
+        </w:rPr>
+        <w:t>8.3 Consulta del inventario</w:t>
+      </w:r>
+    </w:p>
+    <w:p>
+      <w:r>
+        <w:rPr>
+          <w:rFonts w:ascii="Arial" w:hAnsi="Arial" w:eastAsia="Arial"/>
+          <w:color w:val="000000"/>
+          <w:sz w:val="22"/>
+        </w:rPr>
+        <w:t>Captura obtenida el 11 de octubre de 2026 en el modo de demostración local de Bodega Norte.</w:t>
+      </w:r>
+    </w:p>
+    <w:p>
+      <w:pPr>
+        <w:jc w:val="center"/>
+      </w:pPr>
+      <w:r>
+        <w:rPr>
+          <w:rFonts w:ascii="Arial" w:hAnsi="Arial" w:eastAsia="Arial"/>
+          <w:color w:val="000000"/>
+          <w:sz w:val="22"/>
+        </w:rPr>
+        <w:drawing>
+          <wp:inline xmlns:a="http://schemas.openxmlformats.org/drawingml/2006/main" xmlns:pic="http://schemas.openxmlformats.org/drawingml/2006/picture">
+            <wp:extent cx="5577840" cy="3971422"/>
+            <wp:docPr id="4" name="Picture 4"/>
+            <wp:cNvGraphicFramePr>
+              <a:graphicFrameLocks noChangeAspect="1"/>
+            </wp:cNvGraphicFramePr>
+            <a:graphic>
+              <a:graphicData uri="http://schemas.openxmlformats.org/drawingml/2006/picture">
+                <pic:pic>
+                  <pic:nvPicPr>
+                    <pic:cNvPr id="0" name="tmpgf_gozaf.png"/>
+                    <pic:cNvPicPr/>
+                  </pic:nvPicPr>
+                  <pic:blipFill>
+                    <a:blip r:embed="rId12"/>
+                    <a:stretch>
+                      <a:fillRect/>
+                    </a:stretch>
+                  </pic:blipFill>
+                  <pic:spPr>
+                    <a:xfrm>
+                      <a:off x="0" y="0"/>
+                      <a:ext cx="5577840" cy="3971422"/>
+                    </a:xfrm>
+                    <a:prstGeom prst="rect"/>
+                  </pic:spPr>
+                </pic:pic>
+              </a:graphicData>
+            </a:graphic>
+          </wp:inline>
+        </w:drawing>
+      </w:r>
+    </w:p>
+    <w:p>
+      <w:pPr>
+        <w:jc w:val="center"/>
+      </w:pPr>
+      <w:r>
+        <w:rPr>
+          <w:rFonts w:ascii="Arial" w:hAnsi="Arial" w:eastAsia="Arial"/>
+          <w:i/>
+          <w:color w:val="000000"/>
+          <w:sz w:val="22"/>
+        </w:rPr>
+        <w:t>Captura 3. Inventario en la demostración local</w:t>
+      </w:r>
+    </w:p>
+    <w:p>
+      <w:r>
+        <w:rPr>
+          <w:rFonts w:ascii="Arial" w:hAnsi="Arial" w:eastAsia="Arial"/>
+          <w:color w:val="000000"/>
+          <w:sz w:val="22"/>
+        </w:rPr>
+        <w:t>La vista muestra la búsqueda por producto, código, categoría o proveedor; el filtro por disponibilidad; y las columnas de stock, precio, proveedor y estado. Las etiquetas de stock bajo permiten ubicar productos que requieren reposición.</w:t>
+      </w:r>
+    </w:p>
+    <w:p>
+      <w:r>
+        <w:rPr>
+          <w:rFonts w:ascii="Arial" w:hAnsi="Arial" w:eastAsia="Arial"/>
+          <w:color w:val="000000"/>
+          <w:sz w:val="22"/>
+        </w:rPr>
+        <w:br w:type="page"/>
+      </w:r>
+    </w:p>
+    <w:p>
+      <w:pPr>
+        <w:pStyle w:val="Heading2"/>
+        <w:keepNext/>
+        <w:keepLines/>
+      </w:pPr>
+      <w:r>
+        <w:rPr>
+          <w:rFonts w:ascii="Arial" w:hAnsi="Arial" w:eastAsia="Arial"/>
+          <w:color w:val="000000"/>
+          <w:sz w:val="22"/>
+        </w:rPr>
+        <w:t>8.4 Preparación de una venta</w:t>
+      </w:r>
+    </w:p>
+    <w:p>
+      <w:r>
+        <w:rPr>
+          <w:rFonts w:ascii="Arial" w:hAnsi="Arial" w:eastAsia="Arial"/>
+          <w:color w:val="000000"/>
+          <w:sz w:val="22"/>
+        </w:rPr>
+        <w:t>Captura obtenida el 11 de octubre de 2026 en el modo de demostración local de Bodega Norte.</w:t>
+      </w:r>
+    </w:p>
+    <w:p>
+      <w:pPr>
+        <w:jc w:val="center"/>
+      </w:pPr>
+      <w:r>
+        <w:rPr>
+          <w:rFonts w:ascii="Arial" w:hAnsi="Arial" w:eastAsia="Arial"/>
+          <w:color w:val="000000"/>
+          <w:sz w:val="22"/>
+        </w:rPr>
+        <w:drawing>
+          <wp:inline xmlns:a="http://schemas.openxmlformats.org/drawingml/2006/main" xmlns:pic="http://schemas.openxmlformats.org/drawingml/2006/picture">
+            <wp:extent cx="5577840" cy="3971422"/>
+            <wp:docPr id="5" name="Picture 5"/>
+            <wp:cNvGraphicFramePr>
+              <a:graphicFrameLocks noChangeAspect="1"/>
+            </wp:cNvGraphicFramePr>
+            <a:graphic>
+              <a:graphicData uri="http://schemas.openxmlformats.org/drawingml/2006/picture">
+                <pic:pic>
+                  <pic:nvPicPr>
+                    <pic:cNvPr id="0" name="tmp64a6b3pc.png"/>
+                    <pic:cNvPicPr/>
+                  </pic:nvPicPr>
+                  <pic:blipFill>
+                    <a:blip r:embed="rId13"/>
+                    <a:stretch>
+                      <a:fillRect/>
+                    </a:stretch>
+                  </pic:blipFill>
+                  <pic:spPr>
+                    <a:xfrm>
+                      <a:off x="0" y="0"/>
+                      <a:ext cx="5577840" cy="3971422"/>
+                    </a:xfrm>
+                    <a:prstGeom prst="rect"/>
+                  </pic:spPr>
+                </pic:pic>
+              </a:graphicData>
+            </a:graphic>
+          </wp:inline>
+        </w:drawing>
+      </w:r>
+    </w:p>
+    <w:p>
+      <w:pPr>
+        <w:jc w:val="center"/>
+      </w:pPr>
+      <w:r>
+        <w:rPr>
+          <w:rFonts w:ascii="Arial" w:hAnsi="Arial" w:eastAsia="Arial"/>
+          <w:i/>
+          <w:color w:val="000000"/>
+          <w:sz w:val="22"/>
+        </w:rPr>
+        <w:t>Captura 4. Carrito de venta en la demostración local</w:t>
+      </w:r>
+    </w:p>
+    <w:p>
+      <w:r>
+        <w:rPr>
+          <w:rFonts w:ascii="Arial" w:hAnsi="Arial" w:eastAsia="Arial"/>
+          <w:color w:val="000000"/>
+          <w:sz w:val="22"/>
+        </w:rPr>
+        <w:t>El punto de venta reúne el catálogo, las categorías y el carrito. La captura muestra una unidad de Leche Gloria 1L y una unidad de Gaseosa Inca Kola 1.5L, con un total de S/ 13.00. Corresponde a una venta en preparación; no se confirmó el cobro ni se registró una transacción.</w:t>
+      </w:r>
+    </w:p>
+    <w:p>
+      <w:r>
+        <w:rPr>
+          <w:rFonts w:ascii="Arial" w:hAnsi="Arial" w:eastAsia="Arial"/>
+          <w:color w:val="000000"/>
+          <w:sz w:val="22"/>
+        </w:rPr>
+        <w:br w:type="page"/>
+      </w:r>
+    </w:p>
+    <w:p>
+      <w:pPr>
+        <w:pStyle w:val="Heading2"/>
+        <w:keepNext/>
+        <w:keepLines/>
+      </w:pPr>
+      <w:r>
+        <w:rPr>
+          <w:rFonts w:ascii="Arial" w:hAnsi="Arial" w:eastAsia="Arial"/>
+          <w:color w:val="000000"/>
+          <w:sz w:val="22"/>
+        </w:rPr>
+        <w:t>8.5 Consulta de proveedores</w:t>
+      </w:r>
+    </w:p>
+    <w:p>
+      <w:r>
+        <w:rPr>
+          <w:rFonts w:ascii="Arial" w:hAnsi="Arial" w:eastAsia="Arial"/>
+          <w:color w:val="000000"/>
+          <w:sz w:val="22"/>
+        </w:rPr>
+        <w:t>Captura obtenida el 11 de octubre de 2026 en el modo de demostración local de Bodega Norte.</w:t>
+      </w:r>
+    </w:p>
+    <w:p>
+      <w:pPr>
+        <w:jc w:val="center"/>
+      </w:pPr>
+      <w:r>
+        <w:rPr>
+          <w:rFonts w:ascii="Arial" w:hAnsi="Arial" w:eastAsia="Arial"/>
+          <w:color w:val="000000"/>
+          <w:sz w:val="22"/>
+        </w:rPr>
+        <w:drawing>
+          <wp:inline xmlns:a="http://schemas.openxmlformats.org/drawingml/2006/main" xmlns:pic="http://schemas.openxmlformats.org/drawingml/2006/picture">
+            <wp:extent cx="5577840" cy="3956694"/>
+            <wp:docPr id="6" name="Picture 6"/>
+            <wp:cNvGraphicFramePr>
+              <a:graphicFrameLocks noChangeAspect="1"/>
+            </wp:cNvGraphicFramePr>
+            <a:graphic>
+              <a:graphicData uri="http://schemas.openxmlformats.org/drawingml/2006/picture">
+                <pic:pic>
+                  <pic:nvPicPr>
+                    <pic:cNvPr id="0" name="tmpo6qzusxz.png"/>
+                    <pic:cNvPicPr/>
+                  </pic:nvPicPr>
+                  <pic:blipFill>
+                    <a:blip r:embed="rId14"/>
+                    <a:stretch>
+                      <a:fillRect/>
+                    </a:stretch>
+                  </pic:blipFill>
+                  <pic:spPr>
+                    <a:xfrm>
+                      <a:off x="0" y="0"/>
+                      <a:ext cx="5577840" cy="3956694"/>
+                    </a:xfrm>
+                    <a:prstGeom prst="rect"/>
+                  </pic:spPr>
+                </pic:pic>
+              </a:graphicData>
+            </a:graphic>
+          </wp:inline>
+        </w:drawing>
+      </w:r>
+    </w:p>
+    <w:p>
+      <w:pPr>
+        <w:jc w:val="center"/>
+      </w:pPr>
+      <w:r>
+        <w:rPr>
+          <w:rFonts w:ascii="Arial" w:hAnsi="Arial" w:eastAsia="Arial"/>
+          <w:i/>
+          <w:color w:val="000000"/>
+          <w:sz w:val="22"/>
+        </w:rPr>
+        <w:t>Captura 5. Proveedores en la demostración local</w:t>
+      </w:r>
+    </w:p>
+    <w:p>
+      <w:r>
+        <w:rPr>
+          <w:rFonts w:ascii="Arial" w:hAnsi="Arial" w:eastAsia="Arial"/>
+          <w:color w:val="000000"/>
+          <w:sz w:val="22"/>
+        </w:rPr>
+        <w:t>Las tarjetas agrupan el nombre del proveedor, el contacto de ejemplo, el teléfono de demostración y la cantidad de productos asociados. Se muestran las opciones de consulta, edición y eliminación, sin registrar cambios en los proveedores.</w:t>
+      </w:r>
+    </w:p>
+    <w:p>
+      <w:r>
+        <w:rPr>
+          <w:rFonts w:ascii="Arial" w:hAnsi="Arial" w:eastAsia="Arial"/>
+          <w:color w:val="000000"/>
+          <w:sz w:val="22"/>
+        </w:rPr>
+        <w:br w:type="page"/>
+      </w:r>
+    </w:p>
+    <w:p>
+      <w:pPr>
+        <w:pStyle w:val="Heading2"/>
+        <w:keepNext/>
+        <w:keepLines/>
+      </w:pPr>
+      <w:r>
+        <w:rPr>
+          <w:rFonts w:ascii="Arial" w:hAnsi="Arial" w:eastAsia="Arial"/>
+          <w:color w:val="000000"/>
+          <w:sz w:val="22"/>
+        </w:rPr>
+        <w:t>8.6 Consulta de reportes</w:t>
+      </w:r>
+    </w:p>
+    <w:p>
+      <w:r>
+        <w:rPr>
+          <w:rFonts w:ascii="Arial" w:hAnsi="Arial" w:eastAsia="Arial"/>
+          <w:color w:val="000000"/>
+          <w:sz w:val="22"/>
+        </w:rPr>
+        <w:t>Captura obtenida el 11 de octubre de 2026 en el modo de demostración local de Bodega Norte.</w:t>
+      </w:r>
+    </w:p>
+    <w:p>
+      <w:pPr>
+        <w:jc w:val="center"/>
+      </w:pPr>
+      <w:r>
+        <w:rPr>
+          <w:rFonts w:ascii="Arial" w:hAnsi="Arial" w:eastAsia="Arial"/>
+          <w:color w:val="000000"/>
+          <w:sz w:val="22"/>
+        </w:rPr>
+        <w:drawing>
+          <wp:inline xmlns:a="http://schemas.openxmlformats.org/drawingml/2006/main" xmlns:pic="http://schemas.openxmlformats.org/drawingml/2006/picture">
+            <wp:extent cx="5577840" cy="3971422"/>
+            <wp:docPr id="7" name="Picture 7"/>
+            <wp:cNvGraphicFramePr>
+              <a:graphicFrameLocks noChangeAspect="1"/>
+            </wp:cNvGraphicFramePr>
+            <a:graphic>
+              <a:graphicData uri="http://schemas.openxmlformats.org/drawingml/2006/picture">
+                <pic:pic>
+                  <pic:nvPicPr>
+                    <pic:cNvPr id="0" name="tmpe8i42qtx.png"/>
+                    <pic:cNvPicPr/>
+                  </pic:nvPicPr>
+                  <pic:blipFill>
+                    <a:blip r:embed="rId15"/>
+                    <a:stretch>
+                      <a:fillRect/>
+                    </a:stretch>
+                  </pic:blipFill>
+                  <pic:spPr>
+                    <a:xfrm>
+                      <a:off x="0" y="0"/>
+                      <a:ext cx="5577840" cy="3971422"/>
+                    </a:xfrm>
+                    <a:prstGeom prst="rect"/>
+                  </pic:spPr>
+                </pic:pic>
+              </a:graphicData>
+            </a:graphic>
+          </wp:inline>
+        </w:drawing>
+      </w:r>
+    </w:p>
+    <w:p>
+      <w:pPr>
+        <w:jc w:val="center"/>
+      </w:pPr>
+      <w:r>
+        <w:rPr>
+          <w:rFonts w:ascii="Arial" w:hAnsi="Arial" w:eastAsia="Arial"/>
+          <w:i/>
+          <w:color w:val="000000"/>
+          <w:sz w:val="22"/>
+        </w:rPr>
+        <w:t>Captura 6. Reportes en la demostración local</w:t>
+      </w:r>
+    </w:p>
+    <w:p>
+      <w:r>
+        <w:rPr>
+          <w:rFonts w:ascii="Arial" w:hAnsi="Arial" w:eastAsia="Arial"/>
+          <w:color w:val="000000"/>
+          <w:sz w:val="22"/>
+        </w:rPr>
+        <w:t>Los controles Desde y Hasta delimitan el período. La vista presenta ventas, unidades, margen, productos por reponer, ranking y medios de pago. Los valores pertenecen al conjunto de demostración y no representan resultados comerciales reales.</w:t>
       </w:r>
     </w:p>
     <w:sectPr>
-      <w:headerReference w:type="default" r:id="rId12"/>
-      <w:footerReference w:type="default" r:id="rId13"/>
+      <w:headerReference w:type="default" r:id="rId16"/>
+      <w:footerReference w:type="default" r:id="rId17"/>
       <w:pgSz w:w="11906" w:h="16838"/>
       <w:pgMar w:top="1701" w:right="1417" w:bottom="1701" w:left="1417" w:header="720" w:footer="720" w:gutter="0"/>
       <w:cols w:space="720"/>

</xml_diff>